<commit_message>
Templates Phase 18I manual Word canonical token reinsertion
</commit_message>
<xml_diff>
--- a/templates/docx/letters/initial-billing-letter.docx
+++ b/templates/docx/letters/initial-billing-letter.docx
@@ -2,521 +2,332 @@
 <file path=word/document.xml><?xml version="1.0" encoding="utf-8"?>
 <w:document xmlns:wpc="http://schemas.microsoft.com/office/word/2010/wordprocessingCanvas" xmlns:cx="http://schemas.microsoft.com/office/drawing/2014/chartex" xmlns:cx1="http://schemas.microsoft.com/office/drawing/2015/9/8/chartex" xmlns:cx2="http://schemas.microsoft.com/office/drawing/2015/10/21/chartex" xmlns:cx3="http://schemas.microsoft.com/office/drawing/2016/5/9/chartex" xmlns:cx4="http://schemas.microsoft.com/office/drawing/2016/5/10/chartex" xmlns:cx5="http://schemas.microsoft.com/office/drawing/2016/5/11/chartex" xmlns:cx6="http://schemas.microsoft.com/office/drawing/2016/5/12/chartex" xmlns:cx7="http://schemas.microsoft.com/office/drawing/2016/5/13/chartex" xmlns:cx8="http://schemas.microsoft.com/office/drawing/2016/5/14/chartex" xmlns:mc="http://schemas.openxmlformats.org/markup-compatibility/2006" xmlns:m="http://schemas.openxmlformats.org/officeDocument/2006/math" xmlns:aink="http://schemas.microsoft.com/office/drawing/2016/ink" xmlns:am3d="http://schemas.microsoft.com/office/drawing/2017/model3d" xmlns:oel="http://schemas.microsoft.com/office/2019/extlst" xmlns:r="http://schemas.openxmlformats.org/officeDocument/2006/relationships" xmlns:wp14="http://schemas.microsoft.com/office/word/2010/wordprocessingDrawing" xmlns:wp="http://schemas.openxmlformats.org/drawingml/2006/wordprocessingDrawing" xmlns:wpg="http://schemas.microsoft.com/office/word/2010/wordprocessingGroup" xmlns:wpi="http://schemas.microsoft.com/office/word/2010/wordprocessingInk" xmlns:wps="http://schemas.microsoft.com/office/word/2010/wordprocessingShape" xmlns:o="urn:schemas-microsoft-com:office:office" xmlns:v="urn:schemas-microsoft-com:vml" xmlns:w10="urn:schemas-microsoft-com:office:word" xmlns:w="http://schemas.openxmlformats.org/wordprocessingml/2006/main" xmlns:w14="http://schemas.microsoft.com/office/word/2010/wordml" xmlns:w15="http://schemas.microsoft.com/office/word/2012/wordml" xmlns:w16cex="http://schemas.microsoft.com/office/word/2018/wordml/cex" xmlns:w16cid="http://schemas.microsoft.com/office/word/2016/wordml/cid" xmlns:w16="http://schemas.microsoft.com/office/word/2018/wordml" xmlns:w16sdtdh="http://schemas.microsoft.com/office/word/2020/wordml/sdtdatahash" xmlns:w16sdtfl="http://schemas.microsoft.com/office/word/2024/wordml/sdtformatlock" xmlns:w16se="http://schemas.microsoft.com/office/word/2015/wordml/symex" xmlns:w16du="http://schemas.microsoft.com/office/word/2023/wordml/word16du" xmlns:wne="http://schemas.microsoft.com/office/word/2006/wordml" mc:Ignorable="w14 w15 w16se w16cid w16 w16cex w16sdtdh w16sdtfl w16du wp14">
   <w:body>
-    <w:tbl>
-      <w:tblPr>
-        <w:tblStyle w:val="TableGrid"/>
-        <w:tblW w:w="12078" w:type="dxa"/>
-        <w:tblInd w:w="-900" w:type="dxa"/>
-        <w:tblBorders>
-          <w:top w:val="none" w:sz="0" w:space="0" w:color="auto"/>
-          <w:left w:val="none" w:sz="0" w:space="0" w:color="auto"/>
-          <w:bottom w:val="none" w:sz="0" w:space="0" w:color="auto"/>
-          <w:right w:val="none" w:sz="0" w:space="0" w:color="auto"/>
-          <w:insideH w:val="none" w:sz="0" w:space="0" w:color="auto"/>
-          <w:insideV w:val="none" w:sz="0" w:space="0" w:color="auto"/>
-        </w:tblBorders>
-        <w:tblLook w:val="04A0" w:firstRow="1" w:lastRow="0" w:firstColumn="1" w:lastColumn="0" w:noHBand="0" w:noVBand="1"/>
-      </w:tblPr>
-      <w:tblGrid>
-        <w:gridCol w:w="5760"/>
-        <w:gridCol w:w="6318"/>
-      </w:tblGrid>
-      <w:tr>
-        <w:tc>
-          <w:tcPr>
-            <w:tcW w:w="5760" w:type="dxa"/>
-          </w:tcPr>
-          <w:p>
-            <w:pPr>
-              <w:autoSpaceDE w:val="0"/>
-              <w:autoSpaceDN w:val="0"/>
-              <w:adjustRightInd w:val="0"/>
-              <w:ind w:right="-310"/>
-              <w:rPr>
-                <w:rFonts w:cs="BookAntiqua"/>
-                <w:color w:val="000000" w:themeColor="text1"/>
-                <w:sz w:val="40"/>
-                <w:szCs w:val="40"/>
-              </w:rPr>
-            </w:pPr>
-            <w:r>
-              <w:rPr>
-                <w:rFonts w:cs="BookAntiqua"/>
-                <w:color w:val="000000" w:themeColor="text1"/>
-                <w:sz w:val="40"/>
-                <w:szCs w:val="40"/>
-              </w:rPr>
-              <w:t>Barshay, Rizzo &amp; Lopez, PLLC</w:t>
-            </w:r>
-          </w:p>
-          <w:p>
-            <w:pPr>
-              <w:autoSpaceDE w:val="0"/>
-              <w:autoSpaceDN w:val="0"/>
-              <w:adjustRightInd w:val="0"/>
-              <w:rPr>
-                <w:rFonts w:cs="BookAntiqua"/>
-                <w:color w:val="000000" w:themeColor="text1"/>
-                <w:sz w:val="40"/>
-                <w:szCs w:val="40"/>
-              </w:rPr>
-            </w:pPr>
-            <w:r>
-              <w:rPr>
-                <w:rFonts w:cs="BookAntiqua"/>
-                <w:color w:val="000000" w:themeColor="text1"/>
-                <w:sz w:val="28"/>
-                <w:szCs w:val="28"/>
-              </w:rPr>
-              <w:t>Attorneys and Counselors at Law</w:t>
-            </w:r>
-          </w:p>
-        </w:tc>
-        <w:tc>
-          <w:tcPr>
-            <w:tcW w:w="6318" w:type="dxa"/>
-          </w:tcPr>
-          <w:p>
-            <w:pPr>
-              <w:autoSpaceDE w:val="0"/>
-              <w:autoSpaceDN w:val="0"/>
-              <w:adjustRightInd w:val="0"/>
-              <w:rPr>
-                <w:rFonts w:cs="BookAntiqua"/>
-                <w:color w:val="000000" w:themeColor="text1"/>
-              </w:rPr>
-            </w:pPr>
-            <w:r>
-              <w:rPr>
-                <w:rFonts w:cs="BookAntiqua"/>
-                <w:color w:val="000000" w:themeColor="text1"/>
-              </w:rPr>
-              <w:tab/>
-            </w:r>
-            <w:r>
-              <w:rPr>
-                <w:rFonts w:cs="BookAntiqua"/>
-                <w:color w:val="000000" w:themeColor="text1"/>
-              </w:rPr>
-              <w:tab/>
-            </w:r>
-            <w:r>
-              <w:rPr>
-                <w:rFonts w:cs="BookAntiqua"/>
-                <w:color w:val="000000" w:themeColor="text1"/>
-              </w:rPr>
-              <w:t>445 Broadhollow Road | Suite CL18</w:t>
-            </w:r>
-          </w:p>
-          <w:p>
-            <w:pPr>
-              <w:autoSpaceDE w:val="0"/>
-              <w:autoSpaceDN w:val="0"/>
-              <w:adjustRightInd w:val="0"/>
-              <w:rPr>
-                <w:rFonts w:cs="TimesNewRomanPSMT"/>
-                <w:color w:val="000000" w:themeColor="text1"/>
-              </w:rPr>
-            </w:pPr>
-            <w:r>
-              <w:rPr>
-                <w:rFonts w:cs="BookAntiqua"/>
-                <w:color w:val="000000" w:themeColor="text1"/>
-              </w:rPr>
-              <w:tab/>
-            </w:r>
-            <w:r>
-              <w:rPr>
-                <w:rFonts w:cs="BookAntiqua"/>
-                <w:color w:val="000000" w:themeColor="text1"/>
-              </w:rPr>
-              <w:tab/>
-            </w:r>
-            <w:r>
-              <w:rPr>
-                <w:rFonts w:cs="BookAntiqua"/>
-                <w:color w:val="000000" w:themeColor="text1"/>
-              </w:rPr>
-              <w:t>Melville, New York 11747</w:t>
-            </w:r>
-            <w:r>
-              <w:rPr>
-                <w:rFonts w:cs="BookAntiqua"/>
-                <w:color w:val="000000" w:themeColor="text1"/>
-              </w:rPr>
-              <w:br/>
-            </w:r>
-            <w:r>
-              <w:rPr>
-                <w:rFonts w:cs="TimesNewRomanPSMT"/>
-                <w:color w:val="000000" w:themeColor="text1"/>
-              </w:rPr>
-              <w:tab/>
-            </w:r>
-            <w:r>
-              <w:rPr>
-                <w:rFonts w:cs="TimesNewRomanPSMT"/>
-                <w:color w:val="000000" w:themeColor="text1"/>
-              </w:rPr>
-              <w:tab/>
-            </w:r>
-            <w:r>
-              <w:rPr>
-                <w:rFonts w:cs="TimesNewRomanPSMT"/>
-                <w:color w:val="000000" w:themeColor="text1"/>
-              </w:rPr>
-              <w:t>Tel: (631) 210-7272</w:t>
-            </w:r>
-            <w:r>
-              <w:rPr>
-                <w:rFonts w:cs="TimesNewRomanPSMT"/>
-                <w:color w:val="000000" w:themeColor="text1"/>
-              </w:rPr>
-              <w:br/>
-            </w:r>
-            <w:r>
-              <w:rPr>
-                <w:rFonts w:cs="TimesNewRomanPSMT"/>
-                <w:color w:val="000000" w:themeColor="text1"/>
-              </w:rPr>
-              <w:tab/>
-            </w:r>
-            <w:r>
-              <w:rPr>
-                <w:rFonts w:cs="TimesNewRomanPSMT"/>
-                <w:color w:val="000000" w:themeColor="text1"/>
-              </w:rPr>
-              <w:tab/>
-            </w:r>
-            <w:r>
-              <w:rPr>
-                <w:rFonts w:cs="TimesNewRomanPSMT"/>
-                <w:color w:val="000000" w:themeColor="text1"/>
-              </w:rPr>
-              <w:t>Fax: (631) 306-7441</w:t>
-            </w:r>
-          </w:p>
-          <w:p>
-            <w:pPr>
-              <w:autoSpaceDE w:val="0"/>
-              <w:autoSpaceDN w:val="0"/>
-              <w:adjustRightInd w:val="0"/>
-              <w:rPr>
-                <w:rFonts w:cs="TimesNewRomanPSMT"/>
-                <w:color w:val="000000" w:themeColor="text1"/>
-              </w:rPr>
-            </w:pPr>
-          </w:p>
-          <w:p>
-            <w:pPr>
-              <w:autoSpaceDE w:val="0"/>
-              <w:autoSpaceDN w:val="0"/>
-              <w:adjustRightInd w:val="0"/>
-              <w:rPr>
-                <w:rFonts w:cs="BookAntiqua"/>
-                <w:color w:val="000000" w:themeColor="text1"/>
-                <w:sz w:val="40"/>
-                <w:szCs w:val="40"/>
-              </w:rPr>
-            </w:pPr>
-          </w:p>
-        </w:tc>
-      </w:tr>
-      <w:tr>
-        <w:tc>
-          <w:tcPr>
-            <w:tcW w:w="5760" w:type="dxa"/>
-          </w:tcPr>
-          <w:p>
-            <w:pPr>
-              <w:autoSpaceDE w:val="0"/>
-              <w:autoSpaceDN w:val="0"/>
-              <w:adjustRightInd w:val="0"/>
-              <w:ind w:right="-310"/>
-              <w:rPr>
-                <w:rFonts w:cs="BookAntiqua"/>
-                <w:color w:val="000000" w:themeColor="text1"/>
-                <w:sz w:val="40"/>
-                <w:szCs w:val="40"/>
-              </w:rPr>
-            </w:pPr>
-            <w:r>
-              <w:t>&lt;&lt;NOWDT&gt;&gt;</w:t>
-            </w:r>
-          </w:p>
-        </w:tc>
-        <w:tc>
-          <w:tcPr>
-            <w:tcW w:w="6318" w:type="dxa"/>
-          </w:tcPr>
-          <w:p>
-            <w:pPr>
-              <w:autoSpaceDE w:val="0"/>
-              <w:autoSpaceDN w:val="0"/>
-              <w:adjustRightInd w:val="0"/>
-              <w:rPr>
-                <w:rFonts w:cs="BookAntiqua"/>
-                <w:color w:val="000000" w:themeColor="text1"/>
-              </w:rPr>
-            </w:pPr>
-          </w:p>
-        </w:tc>
-      </w:tr>
-    </w:tbl>
-    <w:p>
-      <w:pPr>
-        <w:pStyle w:val="Header"/>
-      </w:pPr>
-    </w:p>
-    <w:tbl>
-      <w:tblPr>
-        <w:tblStyle w:val="TableGrid"/>
-        <w:tblW w:w="0" w:type="auto"/>
-        <w:tblBorders>
-          <w:top w:val="none" w:sz="0" w:space="0" w:color="auto"/>
-          <w:left w:val="none" w:sz="0" w:space="0" w:color="auto"/>
-          <w:bottom w:val="none" w:sz="0" w:space="0" w:color="auto"/>
-          <w:right w:val="none" w:sz="0" w:space="0" w:color="auto"/>
-          <w:insideH w:val="none" w:sz="0" w:space="0" w:color="auto"/>
-          <w:insideV w:val="none" w:sz="0" w:space="0" w:color="auto"/>
-        </w:tblBorders>
-        <w:tblLook w:val="04A0" w:firstRow="1" w:lastRow="0" w:firstColumn="1" w:lastColumn="0" w:noHBand="0" w:noVBand="1"/>
-      </w:tblPr>
-      <w:tblGrid>
-        <w:gridCol w:w="9350"/>
-      </w:tblGrid>
-      <w:tr>
-        <w:tc>
-          <w:tcPr>
-            <w:tcW w:w="9350" w:type="dxa"/>
-          </w:tcPr>
-          <w:p>
-            <w:pPr>
-              <w:jc w:val="both"/>
-            </w:pPr>
-            <w:r>
-              <w:t>&lt;&lt;INSURANCECOMPANY_LOCAL_CITY&gt;&gt;, &lt;&lt;INSURANCECOMPANY_LOCAL_STATE&gt;&gt; &lt;&lt;INSURANCECOMPANY_LOCAL_ZIP&gt;&gt;</w:t>
-            </w:r>
-          </w:p>
-        </w:tc>
-      </w:tr>
-    </w:tbl>
-    <w:p>
-      <w:pPr>
-        <w:ind w:left="720" w:firstLine="720"/>
-        <w:rPr>
-          <w:sz w:val="22"/>
-          <w:szCs w:val="22"/>
-        </w:rPr>
-      </w:pPr>
-      <w:r>
-        <w:rPr>
-          <w:sz w:val="22"/>
-          <w:szCs w:val="22"/>
-        </w:rPr>
-        <w:tab/>
-      </w:r>
-      <w:r>
-        <w:rPr>
-          <w:sz w:val="22"/>
-          <w:szCs w:val="22"/>
-        </w:rPr>
-        <w:tab/>
-      </w:r>
-    </w:p>
-    <w:tbl>
-      <w:tblPr>
-        <w:tblStyle w:val="TableGrid"/>
-        <w:tblW w:w="0" w:type="auto"/>
-        <w:jc w:val="center"/>
-        <w:tblBorders>
-          <w:top w:val="none" w:sz="0" w:space="0" w:color="auto"/>
-          <w:left w:val="none" w:sz="0" w:space="0" w:color="auto"/>
-          <w:bottom w:val="none" w:sz="0" w:space="0" w:color="auto"/>
-          <w:right w:val="none" w:sz="0" w:space="0" w:color="auto"/>
-          <w:insideH w:val="none" w:sz="0" w:space="0" w:color="auto"/>
-          <w:insideV w:val="none" w:sz="0" w:space="0" w:color="auto"/>
-        </w:tblBorders>
-        <w:tblLook w:val="04A0" w:firstRow="1" w:lastRow="0" w:firstColumn="1" w:lastColumn="0" w:noHBand="0" w:noVBand="1"/>
-      </w:tblPr>
-      <w:tblGrid>
-        <w:gridCol w:w="2065"/>
-        <w:gridCol w:w="5490"/>
-      </w:tblGrid>
-      <w:tr>
-        <w:trPr>
-          <w:jc w:val="center"/>
-        </w:trPr>
-        <w:tc>
-          <w:tcPr>
-            <w:tcW w:w="2065" w:type="dxa"/>
-          </w:tcPr>
-          <w:p>
-            <w:r>
-              <w:t>Provider:</w:t>
-            </w:r>
-          </w:p>
-        </w:tc>
-        <w:tc>
-          <w:tcPr>
-            <w:tcW w:w="5490" w:type="dxa"/>
-          </w:tcPr>
-          <w:p>
-            <w:r>
-              <w:t>&lt;&lt;PROVIDER_SUITNAME&gt;&gt;</w:t>
-            </w:r>
-          </w:p>
-        </w:tc>
-      </w:tr>
-      <w:tr>
-        <w:trPr>
-          <w:jc w:val="center"/>
-        </w:trPr>
-        <w:tc>
-          <w:tcPr>
-            <w:tcW w:w="2065" w:type="dxa"/>
-          </w:tcPr>
-          <w:p>
-            <w:r>
-              <w:t>Patient:</w:t>
-            </w:r>
-          </w:p>
-        </w:tc>
-        <w:tc>
-          <w:tcPr>
-            <w:tcW w:w="5490" w:type="dxa"/>
-          </w:tcPr>
-          <w:p>
-            <w:r>
-              <w:t>&lt;&lt;INJUREDPARTY_NAME&gt;&gt;</w:t>
-            </w:r>
-          </w:p>
-        </w:tc>
-      </w:tr>
-      <w:tr>
-        <w:trPr>
-          <w:jc w:val="center"/>
-        </w:trPr>
-        <w:tc>
-          <w:tcPr>
-            <w:tcW w:w="2065" w:type="dxa"/>
-          </w:tcPr>
-          <w:p>
-            <w:r>
-              <w:t>Claim No.:</w:t>
-            </w:r>
-          </w:p>
-        </w:tc>
-        <w:tc>
-          <w:tcPr>
-            <w:tcW w:w="5490" w:type="dxa"/>
-          </w:tcPr>
-          <w:p>
-            <w:r>
-              <w:rPr>
-                <w:color w:val="000000" w:themeColor="text1"/>
-              </w:rPr>
-              <w:t>&lt;&lt;INS_CLAIM_NUMBER&gt;&gt;</w:t>
-            </w:r>
-          </w:p>
-        </w:tc>
-      </w:tr>
-      <w:tr>
-        <w:trPr>
-          <w:jc w:val="center"/>
-        </w:trPr>
-        <w:tc>
-          <w:tcPr>
-            <w:tcW w:w="2065" w:type="dxa"/>
-          </w:tcPr>
-          <w:p>
-            <w:r>
-              <w:t>Amount:</w:t>
-            </w:r>
-          </w:p>
-        </w:tc>
-        <w:tc>
-          <w:tcPr>
-            <w:tcW w:w="5490" w:type="dxa"/>
-          </w:tcPr>
-          <w:p>
-            <w:r>
-              <w:t>&lt;&lt;BALANCE_AMOUNT&gt;&gt;</w:t>
-            </w:r>
-          </w:p>
-        </w:tc>
-      </w:tr>
-      <w:tr>
-        <w:trPr>
-          <w:jc w:val="center"/>
-        </w:trPr>
-        <w:tc>
-          <w:tcPr>
-            <w:tcW w:w="2065" w:type="dxa"/>
-          </w:tcPr>
-          <w:p>
-            <w:r>
-              <w:t>Date of Service:</w:t>
-            </w:r>
-          </w:p>
-          <w:p>
-            <w:r>
-              <w:t>Our File Number:</w:t>
-            </w:r>
-          </w:p>
-        </w:tc>
-        <w:tc>
-          <w:tcPr>
-            <w:tcW w:w="5490" w:type="dxa"/>
-          </w:tcPr>
-          <w:p>
-            <w:r>
-              <w:t>&lt;&lt;DOS_START&gt;&gt;</w:t>
-            </w:r>
-            <w:r>
-              <w:t xml:space="preserve"> - </w:t>
-            </w:r>
-            <w:r>
-              <w:t>&lt;&lt;DOS_END&gt;&gt;</w:t>
-            </w:r>
-          </w:p>
-          <w:p>
-            <w:r>
-              <w:t xml:space="preserve">&lt;&lt;CASE_ID&gt;&gt; </w:t>
-            </w:r>
-          </w:p>
-        </w:tc>
-      </w:tr>
-      <w:tr>
-        <w:trPr>
-          <w:jc w:val="center"/>
-        </w:trPr>
-        <w:tc>
-          <w:tcPr>
-            <w:tcW w:w="2065" w:type="dxa"/>
-          </w:tcPr>
-          <w:p/>
-        </w:tc>
-        <w:tc>
-          <w:tcPr>
-            <w:tcW w:w="5490" w:type="dxa"/>
-          </w:tcPr>
-          <w:p/>
-        </w:tc>
-      </w:tr>
-    </w:tbl>
-    <w:p>
-      <w:pPr>
-        <w:jc w:val="both"/>
-        <w:rPr>
-          <w:sz w:val="22"/>
-          <w:szCs w:val="22"/>
-        </w:rPr>
-      </w:pPr>
-    </w:p>
-    <w:p>
-      <w:pPr>
-        <w:spacing w:after="120"/>
+    <w:p>
+      <w:pPr>
+        <w:ind w:left="4320" w:firstLine="720"/>
+        <w:jc w:val="both"/>
+        <w:rPr>
+          <w:sz w:val="22"/>
+          <w:szCs w:val="22"/>
+        </w:rPr>
+      </w:pPr>
+      <w:r>
+        <w:rPr>
+          <w:sz w:val="22"/>
+          <w:szCs w:val="22"/>
+        </w:rPr>
+        <w:t>{{</w:t>
+      </w:r>
+      <w:proofErr w:type="spellStart"/>
+      <w:r>
+        <w:rPr>
+          <w:sz w:val="22"/>
+          <w:szCs w:val="22"/>
+        </w:rPr>
+        <w:t>letter.date</w:t>
+      </w:r>
+      <w:proofErr w:type="spellEnd"/>
+      <w:r>
+        <w:rPr>
+          <w:sz w:val="22"/>
+          <w:szCs w:val="22"/>
+        </w:rPr>
+        <w:t>}}</w:t>
+      </w:r>
+    </w:p>
+    <w:p>
+      <w:pPr>
+        <w:jc w:val="both"/>
+        <w:rPr>
+          <w:sz w:val="22"/>
+          <w:szCs w:val="22"/>
+        </w:rPr>
+      </w:pPr>
+    </w:p>
+    <w:p>
+      <w:pPr>
+        <w:jc w:val="both"/>
+        <w:rPr>
+          <w:sz w:val="22"/>
+          <w:szCs w:val="22"/>
+        </w:rPr>
+      </w:pPr>
+    </w:p>
+    <w:p>
+      <w:pPr>
+        <w:rPr>
+          <w:sz w:val="22"/>
+          <w:szCs w:val="22"/>
+        </w:rPr>
+      </w:pPr>
+      <w:r>
+        <w:rPr>
+          <w:sz w:val="22"/>
+          <w:szCs w:val="22"/>
+        </w:rPr>
+        <w:t>{{insurer.name}}</w:t>
+      </w:r>
+    </w:p>
+    <w:p>
+      <w:pPr>
+        <w:rPr>
+          <w:sz w:val="22"/>
+          <w:szCs w:val="22"/>
+        </w:rPr>
+      </w:pPr>
+      <w:r>
+        <w:rPr>
+          <w:sz w:val="22"/>
+          <w:szCs w:val="22"/>
+        </w:rPr>
+        <w:t>{{insurer.mailingAddress.line1}}</w:t>
+      </w:r>
+    </w:p>
+    <w:p>
+      <w:pPr>
+        <w:rPr>
+          <w:sz w:val="22"/>
+          <w:szCs w:val="22"/>
+        </w:rPr>
+      </w:pPr>
+      <w:r>
+        <w:rPr>
+          <w:sz w:val="22"/>
+          <w:szCs w:val="22"/>
+        </w:rPr>
+        <w:t>{{</w:t>
+      </w:r>
+      <w:proofErr w:type="spellStart"/>
+      <w:r>
+        <w:rPr>
+          <w:sz w:val="22"/>
+          <w:szCs w:val="22"/>
+        </w:rPr>
+        <w:t>insurer.mailingAddress.city</w:t>
+      </w:r>
+      <w:proofErr w:type="spellEnd"/>
+      <w:r>
+        <w:rPr>
+          <w:sz w:val="22"/>
+          <w:szCs w:val="22"/>
+        </w:rPr>
+        <w:t>}}, {{</w:t>
+      </w:r>
+      <w:proofErr w:type="spellStart"/>
+      <w:r>
+        <w:rPr>
+          <w:sz w:val="22"/>
+          <w:szCs w:val="22"/>
+        </w:rPr>
+        <w:t>insurer.mailingAddress.state</w:t>
+      </w:r>
+      <w:proofErr w:type="spellEnd"/>
+      <w:r>
+        <w:rPr>
+          <w:sz w:val="22"/>
+          <w:szCs w:val="22"/>
+        </w:rPr>
+        <w:t>}} {{insurer.mailingAddress.zip}}</w:t>
+      </w:r>
+    </w:p>
+    <w:p>
+      <w:pPr>
+        <w:jc w:val="both"/>
+        <w:rPr>
+          <w:sz w:val="22"/>
+          <w:szCs w:val="22"/>
+        </w:rPr>
+      </w:pPr>
+    </w:p>
+    <w:p>
+      <w:pPr>
+        <w:jc w:val="both"/>
+        <w:rPr>
+          <w:sz w:val="22"/>
+          <w:szCs w:val="22"/>
+        </w:rPr>
+      </w:pPr>
+    </w:p>
+    <w:p>
+      <w:pPr>
+        <w:ind w:left="1440" w:firstLine="720"/>
+        <w:rPr>
+          <w:sz w:val="22"/>
+          <w:szCs w:val="22"/>
+        </w:rPr>
+      </w:pPr>
+      <w:r>
+        <w:rPr>
+          <w:sz w:val="22"/>
+          <w:szCs w:val="22"/>
+        </w:rPr>
+        <w:t>Provider: {{provider.name}}</w:t>
+      </w:r>
+    </w:p>
+    <w:p>
+      <w:pPr>
+        <w:ind w:left="1440" w:firstLine="720"/>
+        <w:rPr>
+          <w:sz w:val="22"/>
+          <w:szCs w:val="22"/>
+        </w:rPr>
+      </w:pPr>
+      <w:r>
+        <w:rPr>
+          <w:sz w:val="22"/>
+          <w:szCs w:val="22"/>
+        </w:rPr>
+        <w:t>Patient: {{patient.name}}</w:t>
+      </w:r>
+    </w:p>
+    <w:p>
+      <w:pPr>
+        <w:ind w:left="1440" w:firstLine="720"/>
+        <w:rPr>
+          <w:sz w:val="22"/>
+          <w:szCs w:val="22"/>
+        </w:rPr>
+      </w:pPr>
+      <w:r>
+        <w:rPr>
+          <w:sz w:val="22"/>
+          <w:szCs w:val="22"/>
+        </w:rPr>
+        <w:t>Claim No.: {{</w:t>
+      </w:r>
+      <w:proofErr w:type="spellStart"/>
+      <w:r>
+        <w:rPr>
+          <w:sz w:val="22"/>
+          <w:szCs w:val="22"/>
+        </w:rPr>
+        <w:t>claim.number</w:t>
+      </w:r>
+      <w:proofErr w:type="spellEnd"/>
+      <w:r>
+        <w:rPr>
+          <w:sz w:val="22"/>
+          <w:szCs w:val="22"/>
+        </w:rPr>
+        <w:t>}}</w:t>
+      </w:r>
+    </w:p>
+    <w:p>
+      <w:pPr>
+        <w:ind w:left="1440" w:firstLine="720"/>
+        <w:rPr>
+          <w:sz w:val="22"/>
+          <w:szCs w:val="22"/>
+        </w:rPr>
+      </w:pPr>
+      <w:r>
+        <w:rPr>
+          <w:sz w:val="22"/>
+          <w:szCs w:val="22"/>
+        </w:rPr>
+        <w:t>Amount: {{</w:t>
+      </w:r>
+      <w:proofErr w:type="spellStart"/>
+      <w:r>
+        <w:rPr>
+          <w:sz w:val="22"/>
+          <w:szCs w:val="22"/>
+        </w:rPr>
+        <w:t>claim.amount</w:t>
+      </w:r>
+      <w:proofErr w:type="spellEnd"/>
+      <w:r>
+        <w:rPr>
+          <w:sz w:val="22"/>
+          <w:szCs w:val="22"/>
+        </w:rPr>
+        <w:t>}}</w:t>
+      </w:r>
+    </w:p>
+    <w:p>
+      <w:pPr>
+        <w:ind w:left="1440" w:firstLine="720"/>
+        <w:rPr>
+          <w:sz w:val="22"/>
+          <w:szCs w:val="22"/>
+        </w:rPr>
+      </w:pPr>
+      <w:r>
+        <w:rPr>
+          <w:sz w:val="22"/>
+          <w:szCs w:val="22"/>
+        </w:rPr>
+        <w:t>Date of Service: {{</w:t>
+      </w:r>
+      <w:proofErr w:type="spellStart"/>
+      <w:r>
+        <w:rPr>
+          <w:sz w:val="22"/>
+          <w:szCs w:val="22"/>
+        </w:rPr>
+        <w:t>claim.dosRange</w:t>
+      </w:r>
+      <w:proofErr w:type="spellEnd"/>
+      <w:r>
+        <w:rPr>
+          <w:sz w:val="22"/>
+          <w:szCs w:val="22"/>
+        </w:rPr>
+        <w:t>}}</w:t>
+      </w:r>
+    </w:p>
+    <w:p>
+      <w:pPr>
+        <w:ind w:left="1440" w:firstLine="720"/>
+        <w:rPr>
+          <w:sz w:val="22"/>
+          <w:szCs w:val="22"/>
+        </w:rPr>
+      </w:pPr>
+      <w:r>
+        <w:rPr>
+          <w:sz w:val="22"/>
+          <w:szCs w:val="22"/>
+        </w:rPr>
+        <w:t>Our File Number: {{</w:t>
+      </w:r>
+      <w:proofErr w:type="spellStart"/>
+      <w:r>
+        <w:rPr>
+          <w:sz w:val="22"/>
+          <w:szCs w:val="22"/>
+        </w:rPr>
+        <w:t>matter.fileNumber</w:t>
+      </w:r>
+      <w:proofErr w:type="spellEnd"/>
+      <w:r>
+        <w:rPr>
+          <w:sz w:val="22"/>
+          <w:szCs w:val="22"/>
+        </w:rPr>
+        <w:t>}}</w:t>
+      </w:r>
+    </w:p>
+    <w:p>
+      <w:pPr>
+        <w:jc w:val="both"/>
+        <w:rPr>
+          <w:sz w:val="22"/>
+          <w:szCs w:val="22"/>
+        </w:rPr>
+      </w:pPr>
+    </w:p>
+    <w:p>
+      <w:pPr>
+        <w:jc w:val="both"/>
+        <w:rPr>
+          <w:sz w:val="22"/>
+          <w:szCs w:val="22"/>
+        </w:rPr>
+      </w:pPr>
+    </w:p>
+    <w:p>
+      <w:pPr>
         <w:jc w:val="both"/>
         <w:rPr>
           <w:color w:val="000000" w:themeColor="text1"/>
@@ -535,7 +346,16 @@
     </w:p>
     <w:p>
       <w:pPr>
-        <w:spacing w:after="120"/>
+        <w:jc w:val="both"/>
+        <w:rPr>
+          <w:color w:val="000000" w:themeColor="text1"/>
+          <w:sz w:val="22"/>
+          <w:szCs w:val="22"/>
+        </w:rPr>
+      </w:pPr>
+    </w:p>
+    <w:p>
+      <w:pPr>
         <w:ind w:firstLine="720"/>
         <w:jc w:val="both"/>
         <w:rPr>
@@ -555,7 +375,6 @@
     </w:p>
     <w:p>
       <w:pPr>
-        <w:spacing w:after="120"/>
         <w:ind w:firstLine="720"/>
         <w:jc w:val="both"/>
         <w:rPr>
@@ -564,6 +383,17 @@
           <w:szCs w:val="22"/>
         </w:rPr>
       </w:pPr>
+    </w:p>
+    <w:p>
+      <w:pPr>
+        <w:ind w:firstLine="720"/>
+        <w:jc w:val="both"/>
+        <w:rPr>
+          <w:color w:val="000000" w:themeColor="text1"/>
+          <w:sz w:val="22"/>
+          <w:szCs w:val="22"/>
+        </w:rPr>
+      </w:pPr>
       <w:r>
         <w:rPr>
           <w:color w:val="000000" w:themeColor="text1"/>
@@ -745,7 +575,6 @@
     </w:p>
     <w:p>
       <w:pPr>
-        <w:spacing w:after="120"/>
         <w:ind w:firstLine="720"/>
         <w:jc w:val="both"/>
         <w:rPr>
@@ -754,6 +583,17 @@
           <w:szCs w:val="22"/>
         </w:rPr>
       </w:pPr>
+    </w:p>
+    <w:p>
+      <w:pPr>
+        <w:ind w:firstLine="720"/>
+        <w:jc w:val="both"/>
+        <w:rPr>
+          <w:color w:val="000000" w:themeColor="text1"/>
+          <w:sz w:val="22"/>
+          <w:szCs w:val="22"/>
+        </w:rPr>
+      </w:pPr>
       <w:r>
         <w:rPr>
           <w:color w:val="000000" w:themeColor="text1"/>
@@ -794,12 +634,19 @@
           <w:sz w:val="22"/>
           <w:szCs w:val="22"/>
         </w:rPr>
-        <w:t xml:space="preserve"> our office.</w:t>
-      </w:r>
-    </w:p>
-    <w:p>
-      <w:pPr>
-        <w:spacing w:after="120"/>
+        <w:t xml:space="preserve"> our office</w:t>
+      </w:r>
+      <w:r>
+        <w:rPr>
+          <w:color w:val="000000" w:themeColor="text1"/>
+          <w:sz w:val="22"/>
+          <w:szCs w:val="22"/>
+        </w:rPr>
+        <w:t>.</w:t>
+      </w:r>
+    </w:p>
+    <w:p>
+      <w:pPr>
         <w:ind w:firstLine="720"/>
         <w:jc w:val="both"/>
         <w:rPr>
@@ -808,6 +655,17 @@
           <w:szCs w:val="22"/>
         </w:rPr>
       </w:pPr>
+    </w:p>
+    <w:p>
+      <w:pPr>
+        <w:ind w:firstLine="720"/>
+        <w:jc w:val="both"/>
+        <w:rPr>
+          <w:color w:val="000000" w:themeColor="text1"/>
+          <w:sz w:val="22"/>
+          <w:szCs w:val="22"/>
+        </w:rPr>
+      </w:pPr>
       <w:r>
         <w:rPr>
           <w:color w:val="000000" w:themeColor="text1"/>
@@ -840,7 +698,45 @@
           <w:szCs w:val="22"/>
           <w:shd w:val="clear" w:color="auto" w:fill="FFFFFF"/>
         </w:rPr>
-        <w:t xml:space="preserve">peer review report requested by the insurer, </w:t>
+        <w:t xml:space="preserve">peer review report requested by the insurer, demand is hereby made for a copy of that report pursuant to </w:t>
+      </w:r>
+      <w:r>
+        <w:rPr>
+          <w:color w:val="000000" w:themeColor="text1"/>
+          <w:sz w:val="22"/>
+          <w:szCs w:val="22"/>
+        </w:rPr>
+        <w:t>11 N.Y.C.R.R. 65-3.8(b)(4), and for a copy of all documents provided to the examiner pursuant to 11 N.Y.C.R.R. 65-3.2(b), (e) and (f).</w:t>
+      </w:r>
+    </w:p>
+    <w:p>
+      <w:pPr>
+        <w:ind w:firstLine="720"/>
+        <w:jc w:val="both"/>
+        <w:rPr>
+          <w:color w:val="000000" w:themeColor="text1"/>
+          <w:sz w:val="22"/>
+          <w:szCs w:val="22"/>
+        </w:rPr>
+      </w:pPr>
+    </w:p>
+    <w:p>
+      <w:pPr>
+        <w:ind w:firstLine="720"/>
+        <w:jc w:val="both"/>
+        <w:rPr>
+          <w:color w:val="000000" w:themeColor="text1"/>
+          <w:sz w:val="22"/>
+          <w:szCs w:val="22"/>
+        </w:rPr>
+      </w:pPr>
+      <w:r>
+        <w:rPr>
+          <w:color w:val="000000" w:themeColor="text1"/>
+          <w:sz w:val="22"/>
+          <w:szCs w:val="22"/>
+        </w:rPr>
+        <w:t>The demand for the above-mentioned documentation is made in order to allow the applicant provider an opportunity to review and respond to the merits, or lack thereof, of the denial.  Where the denial is based on a medical examination or p</w:t>
       </w:r>
       <w:r>
         <w:rPr>
@@ -849,71 +745,7 @@
           <w:szCs w:val="22"/>
           <w:shd w:val="clear" w:color="auto" w:fill="FFFFFF"/>
         </w:rPr>
-        <w:t xml:space="preserve">demand is hereby made for a </w:t>
-      </w:r>
-      <w:r>
-        <w:rPr>
-          <w:color w:val="000000" w:themeColor="text1"/>
-          <w:sz w:val="22"/>
-          <w:szCs w:val="22"/>
-          <w:shd w:val="clear" w:color="auto" w:fill="FFFFFF"/>
-        </w:rPr>
-        <w:t xml:space="preserve">copy of that report </w:t>
-      </w:r>
-      <w:r>
-        <w:rPr>
-          <w:color w:val="000000" w:themeColor="text1"/>
-          <w:sz w:val="22"/>
-          <w:szCs w:val="22"/>
-          <w:shd w:val="clear" w:color="auto" w:fill="FFFFFF"/>
-        </w:rPr>
-        <w:t xml:space="preserve">pursuant to </w:t>
-      </w:r>
-      <w:r>
-        <w:rPr>
-          <w:color w:val="000000" w:themeColor="text1"/>
-          <w:sz w:val="22"/>
-          <w:szCs w:val="22"/>
-        </w:rPr>
-        <w:t xml:space="preserve">11 N.Y.C.R.R. 65-3.8(b)(4), and for a copy of all documents provided to the examiner pursuant to 11 N.Y.C.R.R. 65-3.2(b), (e) and (f).  </w:t>
-      </w:r>
-    </w:p>
-    <w:p>
-      <w:pPr>
-        <w:spacing w:after="120"/>
-        <w:ind w:firstLine="720"/>
-        <w:jc w:val="both"/>
-        <w:rPr>
-          <w:color w:val="000000" w:themeColor="text1"/>
-          <w:sz w:val="22"/>
-          <w:szCs w:val="22"/>
-        </w:rPr>
-      </w:pPr>
-      <w:r>
-        <w:rPr>
-          <w:color w:val="000000" w:themeColor="text1"/>
-          <w:sz w:val="22"/>
-          <w:szCs w:val="22"/>
-        </w:rPr>
-        <w:t>The demand for the above-mentioned documentation is made in order to allow the applicant provider an opportunity to review and respond to the merits, or lack thereof, of the denial.  Where the denial is based on a medical examination or p</w:t>
-      </w:r>
-      <w:r>
-        <w:rPr>
-          <w:color w:val="000000" w:themeColor="text1"/>
-          <w:sz w:val="22"/>
-          <w:szCs w:val="22"/>
-          <w:shd w:val="clear" w:color="auto" w:fill="FFFFFF"/>
-        </w:rPr>
-        <w:t>eer revie</w:t>
-      </w:r>
-      <w:r>
-        <w:rPr>
-          <w:color w:val="000000" w:themeColor="text1"/>
-          <w:sz w:val="22"/>
-          <w:szCs w:val="22"/>
-          <w:shd w:val="clear" w:color="auto" w:fill="FFFFFF"/>
-        </w:rPr>
-        <w:t>w, t</w:t>
+        <w:t>eer review, t</w:t>
       </w:r>
       <w:r>
         <w:rPr>
@@ -923,6 +755,17 @@
         </w:rPr>
         <w:t xml:space="preserve">he demand for the above-mentioned documentation is made in order to allow the applicant provider the opportunity to review the same materials given to the examiner and, where appropriate, submit a response to the medical examination or peer review, and/or to obtain a rebuttal opinion from an appropriate medical professional.  The failure to provide the demanded documentation will be construed as an intentional attempt to frustrate the applicant provider's ability to respond to the denial of benefits.  </w:t>
       </w:r>
+    </w:p>
+    <w:p>
+      <w:pPr>
+        <w:ind w:left="4320" w:firstLine="720"/>
+        <w:jc w:val="both"/>
+        <w:rPr>
+          <w:color w:val="000000" w:themeColor="text1"/>
+          <w:sz w:val="22"/>
+          <w:szCs w:val="22"/>
+        </w:rPr>
+      </w:pPr>
     </w:p>
     <w:p>
       <w:pPr>
@@ -931,15 +774,15 @@
         <w:jc w:val="both"/>
         <w:rPr>
           <w:color w:val="000000" w:themeColor="text1"/>
-          <w:sz w:val="21"/>
-          <w:szCs w:val="21"/>
-        </w:rPr>
-      </w:pPr>
-      <w:r>
-        <w:rPr>
-          <w:color w:val="000000" w:themeColor="text1"/>
-          <w:sz w:val="21"/>
-          <w:szCs w:val="21"/>
+          <w:sz w:val="22"/>
+          <w:szCs w:val="22"/>
+        </w:rPr>
+      </w:pPr>
+      <w:r>
+        <w:rPr>
+          <w:color w:val="000000" w:themeColor="text1"/>
+          <w:sz w:val="22"/>
+          <w:szCs w:val="22"/>
         </w:rPr>
         <w:t xml:space="preserve">Very truly yours, </w:t>
       </w:r>
@@ -950,8 +793,8 @@
         <w:jc w:val="both"/>
         <w:rPr>
           <w:color w:val="000000" w:themeColor="text1"/>
-          <w:sz w:val="21"/>
-          <w:szCs w:val="21"/>
+          <w:sz w:val="22"/>
+          <w:szCs w:val="22"/>
         </w:rPr>
       </w:pPr>
     </w:p>
@@ -961,20 +804,29 @@
         <w:jc w:val="both"/>
         <w:rPr>
           <w:color w:val="000000" w:themeColor="text1"/>
-          <w:sz w:val="21"/>
-          <w:szCs w:val="21"/>
-        </w:rPr>
-      </w:pPr>
-      <w:r>
-        <w:rPr>
-          <w:color w:val="000000" w:themeColor="text1"/>
-          <w:sz w:val="21"/>
-          <w:szCs w:val="21"/>
+          <w:sz w:val="22"/>
+          <w:szCs w:val="22"/>
+        </w:rPr>
+      </w:pPr>
+    </w:p>
+    <w:p>
+      <w:pPr>
+        <w:ind w:left="5040"/>
+        <w:jc w:val="both"/>
+        <w:rPr>
+          <w:sz w:val="22"/>
+          <w:szCs w:val="22"/>
+        </w:rPr>
+      </w:pPr>
+      <w:r>
+        <w:rPr>
+          <w:color w:val="000000" w:themeColor="text1"/>
+          <w:sz w:val="22"/>
+          <w:szCs w:val="22"/>
         </w:rPr>
         <w:t>Barshay, Rizzo &amp; Lopez, PLLC</w:t>
       </w:r>
     </w:p>
-    <w:p/>
     <w:sectPr>
       <w:pgSz w:w="12240" w:h="15840"/>
       <w:pgMar w:top="1440" w:right="1440" w:bottom="1440" w:left="1440" w:header="720" w:footer="720" w:gutter="0"/>

</xml_diff>